<commit_message>
Drop two screens that were copies of a third
app-03 and app-04 were byte-identical to the Mass Schedule capture:
the bulletin chip taps stopped registering in a later capture run and
overwrote both with the same picture, so the document carried one
screenshot under three different captions.

Found by counting the images Word embedded - 32 for 34 screens, because
python-docx reuses a relationship for identical bytes. A caption that
describes a picture it is not sitting next to is worse than a missing
screen, and the full Church History and Ministries screens are already
in the set, so the two copies are simply gone.

Co-Authored-By: Claude Opus 5 <noreply@anthropic.com>
</commit_message>
<xml_diff>
--- a/docs/SanctiWalk-App-Screens.docx
+++ b/docs/SanctiWalk-App-Screens.docx
@@ -430,163 +430,6 @@
                     <a:graphicData uri="http://schemas.openxmlformats.org/drawingml/2006/picture">
                       <pic:pic>
                         <pic:nvPicPr>
-                          <pic:cNvPr id="0" name="app-02-mass-schedule.jpg"/>
-                          <pic:cNvPicPr/>
-                        </pic:nvPicPr>
-                        <pic:blipFill>
-                          <a:blip r:embed="rId13"/>
-                          <a:stretch>
-                            <a:fillRect/>
-                          </a:stretch>
-                        </pic:blipFill>
-                        <pic:spPr>
-                          <a:xfrm>
-                            <a:off x="0" y="0"/>
-                            <a:ext cx="2286000" cy="4948084"/>
-                          </a:xfrm>
-                          <a:prstGeom prst="rect"/>
-                        </pic:spPr>
-                      </pic:pic>
-                    </a:graphicData>
-                  </a:graphic>
-                </wp:inline>
-              </w:drawing>
-            </w:r>
-          </w:p>
-          <w:p>
-            <w:pPr>
-              <w:jc w:val="center"/>
-            </w:pPr>
-            <w:r>
-              <w:rPr>
-                <w:b/>
-                <w:color w:val="142C56"/>
-                <w:sz w:val="20"/>
-              </w:rPr>
-              <w:t>Bulletin — History</w:t>
-            </w:r>
-          </w:p>
-          <w:p>
-            <w:pPr>
-              <w:jc w:val="center"/>
-            </w:pPr>
-            <w:r>
-              <w:rPr>
-                <w:color w:val="6B7280"/>
-                <w:sz w:val="16"/>
-              </w:rPr>
-              <w:t>The opening lines, with Learn more.</w:t>
-            </w:r>
-          </w:p>
-        </w:tc>
-      </w:tr>
-    </w:tbl>
-    <w:p>
-      <w:r>
-        <w:br w:type="page"/>
-      </w:r>
-    </w:p>
-    <w:tbl>
-      <w:tblPr>
-        <w:tblW w:type="auto" w:w="0"/>
-        <w:jc w:val="center"/>
-        <w:tblLayout w:type="fixed"/>
-        <w:tblLook w:firstColumn="1" w:firstRow="1" w:lastColumn="0" w:lastRow="0" w:noHBand="0" w:noVBand="1" w:val="04A0"/>
-      </w:tblPr>
-      <w:tblGrid>
-        <w:gridCol w:w="5256"/>
-        <w:gridCol w:w="5256"/>
-      </w:tblGrid>
-      <w:tr>
-        <w:tc>
-          <w:tcPr>
-            <w:tcW w:type="dxa" w:w="5112"/>
-          </w:tcPr>
-          <w:p>
-            <w:pPr>
-              <w:jc w:val="center"/>
-            </w:pPr>
-            <w:r>
-              <w:drawing>
-                <wp:inline xmlns:a="http://schemas.openxmlformats.org/drawingml/2006/main" xmlns:pic="http://schemas.openxmlformats.org/drawingml/2006/picture">
-                  <wp:extent cx="2286000" cy="4948084"/>
-                  <wp:docPr id="7" name="Picture 7"/>
-                  <wp:cNvGraphicFramePr>
-                    <a:graphicFrameLocks noChangeAspect="1"/>
-                  </wp:cNvGraphicFramePr>
-                  <a:graphic>
-                    <a:graphicData uri="http://schemas.openxmlformats.org/drawingml/2006/picture">
-                      <pic:pic>
-                        <pic:nvPicPr>
-                          <pic:cNvPr id="0" name="app-02-mass-schedule.jpg"/>
-                          <pic:cNvPicPr/>
-                        </pic:nvPicPr>
-                        <pic:blipFill>
-                          <a:blip r:embed="rId13"/>
-                          <a:stretch>
-                            <a:fillRect/>
-                          </a:stretch>
-                        </pic:blipFill>
-                        <pic:spPr>
-                          <a:xfrm>
-                            <a:off x="0" y="0"/>
-                            <a:ext cx="2286000" cy="4948084"/>
-                          </a:xfrm>
-                          <a:prstGeom prst="rect"/>
-                        </pic:spPr>
-                      </pic:pic>
-                    </a:graphicData>
-                  </a:graphic>
-                </wp:inline>
-              </w:drawing>
-            </w:r>
-          </w:p>
-          <w:p>
-            <w:pPr>
-              <w:jc w:val="center"/>
-            </w:pPr>
-            <w:r>
-              <w:rPr>
-                <w:b/>
-                <w:color w:val="142C56"/>
-                <w:sz w:val="20"/>
-              </w:rPr>
-              <w:t>Bulletin — Ministry &amp; Sacraments</w:t>
-            </w:r>
-          </w:p>
-          <w:p>
-            <w:pPr>
-              <w:jc w:val="center"/>
-            </w:pPr>
-            <w:r>
-              <w:rPr>
-                <w:color w:val="6B7280"/>
-                <w:sz w:val="16"/>
-              </w:rPr>
-              <w:t>The bulletin's third section.</w:t>
-            </w:r>
-          </w:p>
-        </w:tc>
-        <w:tc>
-          <w:tcPr>
-            <w:tcW w:type="dxa" w:w="5112"/>
-          </w:tcPr>
-          <w:p>
-            <w:pPr>
-              <w:jc w:val="center"/>
-            </w:pPr>
-            <w:r>
-              <w:drawing>
-                <wp:inline xmlns:a="http://schemas.openxmlformats.org/drawingml/2006/main" xmlns:pic="http://schemas.openxmlformats.org/drawingml/2006/picture">
-                  <wp:extent cx="2286000" cy="4948084"/>
-                  <wp:docPr id="8" name="Picture 8"/>
-                  <wp:cNvGraphicFramePr>
-                    <a:graphicFrameLocks noChangeAspect="1"/>
-                  </wp:cNvGraphicFramePr>
-                  <a:graphic>
-                    <a:graphicData uri="http://schemas.openxmlformats.org/drawingml/2006/picture">
-                      <pic:pic>
-                        <pic:nvPicPr>
                           <pic:cNvPr id="0" name="app-13-church-history-full.jpg"/>
                           <pic:cNvPicPr/>
                         </pic:nvPicPr>
@@ -667,7 +510,7 @@
               <w:drawing>
                 <wp:inline xmlns:a="http://schemas.openxmlformats.org/drawingml/2006/main" xmlns:pic="http://schemas.openxmlformats.org/drawingml/2006/picture">
                   <wp:extent cx="2286000" cy="4948084"/>
-                  <wp:docPr id="9" name="Picture 9"/>
+                  <wp:docPr id="7" name="Picture 7"/>
                   <wp:cNvGraphicFramePr>
                     <a:graphicFrameLocks noChangeAspect="1"/>
                   </wp:cNvGraphicFramePr>
@@ -736,7 +579,7 @@
               <w:drawing>
                 <wp:inline xmlns:a="http://schemas.openxmlformats.org/drawingml/2006/main" xmlns:pic="http://schemas.openxmlformats.org/drawingml/2006/picture">
                   <wp:extent cx="2286000" cy="4948084"/>
-                  <wp:docPr id="10" name="Picture 10"/>
+                  <wp:docPr id="8" name="Picture 8"/>
                   <wp:cNvGraphicFramePr>
                     <a:graphicFrameLocks noChangeAspect="1"/>
                   </wp:cNvGraphicFramePr>
@@ -824,7 +667,7 @@
               <w:drawing>
                 <wp:inline xmlns:a="http://schemas.openxmlformats.org/drawingml/2006/main" xmlns:pic="http://schemas.openxmlformats.org/drawingml/2006/picture">
                   <wp:extent cx="2286000" cy="4948084"/>
-                  <wp:docPr id="11" name="Picture 11"/>
+                  <wp:docPr id="9" name="Picture 9"/>
                   <wp:cNvGraphicFramePr>
                     <a:graphicFrameLocks noChangeAspect="1"/>
                   </wp:cNvGraphicFramePr>
@@ -893,7 +736,7 @@
               <w:drawing>
                 <wp:inline xmlns:a="http://schemas.openxmlformats.org/drawingml/2006/main" xmlns:pic="http://schemas.openxmlformats.org/drawingml/2006/picture">
                   <wp:extent cx="2286000" cy="4948084"/>
-                  <wp:docPr id="12" name="Picture 12"/>
+                  <wp:docPr id="10" name="Picture 10"/>
                   <wp:cNvGraphicFramePr>
                     <a:graphicFrameLocks noChangeAspect="1"/>
                   </wp:cNvGraphicFramePr>
@@ -981,7 +824,7 @@
               <w:drawing>
                 <wp:inline xmlns:a="http://schemas.openxmlformats.org/drawingml/2006/main" xmlns:pic="http://schemas.openxmlformats.org/drawingml/2006/picture">
                   <wp:extent cx="2286000" cy="4948084"/>
-                  <wp:docPr id="13" name="Picture 13"/>
+                  <wp:docPr id="11" name="Picture 11"/>
                   <wp:cNvGraphicFramePr>
                     <a:graphicFrameLocks noChangeAspect="1"/>
                   </wp:cNvGraphicFramePr>
@@ -1050,7 +893,7 @@
               <w:drawing>
                 <wp:inline xmlns:a="http://schemas.openxmlformats.org/drawingml/2006/main" xmlns:pic="http://schemas.openxmlformats.org/drawingml/2006/picture">
                   <wp:extent cx="2286000" cy="4948084"/>
-                  <wp:docPr id="14" name="Picture 14"/>
+                  <wp:docPr id="12" name="Picture 12"/>
                   <wp:cNvGraphicFramePr>
                     <a:graphicFrameLocks noChangeAspect="1"/>
                   </wp:cNvGraphicFramePr>
@@ -1138,7 +981,7 @@
               <w:drawing>
                 <wp:inline xmlns:a="http://schemas.openxmlformats.org/drawingml/2006/main" xmlns:pic="http://schemas.openxmlformats.org/drawingml/2006/picture">
                   <wp:extent cx="2286000" cy="4948084"/>
-                  <wp:docPr id="15" name="Picture 15"/>
+                  <wp:docPr id="13" name="Picture 13"/>
                   <wp:cNvGraphicFramePr>
                     <a:graphicFrameLocks noChangeAspect="1"/>
                   </wp:cNvGraphicFramePr>
@@ -1207,7 +1050,7 @@
               <w:drawing>
                 <wp:inline xmlns:a="http://schemas.openxmlformats.org/drawingml/2006/main" xmlns:pic="http://schemas.openxmlformats.org/drawingml/2006/picture">
                   <wp:extent cx="2286000" cy="4948084"/>
-                  <wp:docPr id="16" name="Picture 16"/>
+                  <wp:docPr id="14" name="Picture 14"/>
                   <wp:cNvGraphicFramePr>
                     <a:graphicFrameLocks noChangeAspect="1"/>
                   </wp:cNvGraphicFramePr>
@@ -1295,7 +1138,7 @@
               <w:drawing>
                 <wp:inline xmlns:a="http://schemas.openxmlformats.org/drawingml/2006/main" xmlns:pic="http://schemas.openxmlformats.org/drawingml/2006/picture">
                   <wp:extent cx="2286000" cy="5003390"/>
-                  <wp:docPr id="17" name="Picture 17"/>
+                  <wp:docPr id="15" name="Picture 15"/>
                   <wp:cNvGraphicFramePr>
                     <a:graphicFrameLocks noChangeAspect="1"/>
                   </wp:cNvGraphicFramePr>
@@ -1364,7 +1207,7 @@
               <w:drawing>
                 <wp:inline xmlns:a="http://schemas.openxmlformats.org/drawingml/2006/main" xmlns:pic="http://schemas.openxmlformats.org/drawingml/2006/picture">
                   <wp:extent cx="2286000" cy="5003390"/>
-                  <wp:docPr id="18" name="Picture 18"/>
+                  <wp:docPr id="16" name="Picture 16"/>
                   <wp:cNvGraphicFramePr>
                     <a:graphicFrameLocks noChangeAspect="1"/>
                   </wp:cNvGraphicFramePr>
@@ -1452,7 +1295,7 @@
               <w:drawing>
                 <wp:inline xmlns:a="http://schemas.openxmlformats.org/drawingml/2006/main" xmlns:pic="http://schemas.openxmlformats.org/drawingml/2006/picture">
                   <wp:extent cx="2286000" cy="4948084"/>
-                  <wp:docPr id="19" name="Picture 19"/>
+                  <wp:docPr id="17" name="Picture 17"/>
                   <wp:cNvGraphicFramePr>
                     <a:graphicFrameLocks noChangeAspect="1"/>
                   </wp:cNvGraphicFramePr>
@@ -1521,7 +1364,7 @@
               <w:drawing>
                 <wp:inline xmlns:a="http://schemas.openxmlformats.org/drawingml/2006/main" xmlns:pic="http://schemas.openxmlformats.org/drawingml/2006/picture">
                   <wp:extent cx="2286000" cy="4948084"/>
-                  <wp:docPr id="20" name="Picture 20"/>
+                  <wp:docPr id="18" name="Picture 18"/>
                   <wp:cNvGraphicFramePr>
                     <a:graphicFrameLocks noChangeAspect="1"/>
                   </wp:cNvGraphicFramePr>
@@ -1609,7 +1452,7 @@
               <w:drawing>
                 <wp:inline xmlns:a="http://schemas.openxmlformats.org/drawingml/2006/main" xmlns:pic="http://schemas.openxmlformats.org/drawingml/2006/picture">
                   <wp:extent cx="2286000" cy="5003390"/>
-                  <wp:docPr id="21" name="Picture 21"/>
+                  <wp:docPr id="19" name="Picture 19"/>
                   <wp:cNvGraphicFramePr>
                     <a:graphicFrameLocks noChangeAspect="1"/>
                   </wp:cNvGraphicFramePr>
@@ -1678,7 +1521,7 @@
               <w:drawing>
                 <wp:inline xmlns:a="http://schemas.openxmlformats.org/drawingml/2006/main" xmlns:pic="http://schemas.openxmlformats.org/drawingml/2006/picture">
                   <wp:extent cx="2286000" cy="5003390"/>
-                  <wp:docPr id="22" name="Picture 22"/>
+                  <wp:docPr id="20" name="Picture 20"/>
                   <wp:cNvGraphicFramePr>
                     <a:graphicFrameLocks noChangeAspect="1"/>
                   </wp:cNvGraphicFramePr>
@@ -1766,7 +1609,7 @@
               <w:drawing>
                 <wp:inline xmlns:a="http://schemas.openxmlformats.org/drawingml/2006/main" xmlns:pic="http://schemas.openxmlformats.org/drawingml/2006/picture">
                   <wp:extent cx="2286000" cy="5003390"/>
-                  <wp:docPr id="23" name="Picture 23"/>
+                  <wp:docPr id="21" name="Picture 21"/>
                   <wp:cNvGraphicFramePr>
                     <a:graphicFrameLocks noChangeAspect="1"/>
                   </wp:cNvGraphicFramePr>
@@ -1835,7 +1678,7 @@
               <w:drawing>
                 <wp:inline xmlns:a="http://schemas.openxmlformats.org/drawingml/2006/main" xmlns:pic="http://schemas.openxmlformats.org/drawingml/2006/picture">
                   <wp:extent cx="2286000" cy="4948084"/>
-                  <wp:docPr id="24" name="Picture 24"/>
+                  <wp:docPr id="22" name="Picture 22"/>
                   <wp:cNvGraphicFramePr>
                     <a:graphicFrameLocks noChangeAspect="1"/>
                   </wp:cNvGraphicFramePr>
@@ -1907,7 +1750,7 @@
         <w:drawing>
           <wp:inline xmlns:a="http://schemas.openxmlformats.org/drawingml/2006/main" xmlns:pic="http://schemas.openxmlformats.org/drawingml/2006/picture">
             <wp:extent cx="6400800" cy="4750594"/>
-            <wp:docPr id="25" name="Picture 25"/>
+            <wp:docPr id="23" name="Picture 23"/>
             <wp:cNvGraphicFramePr>
               <a:graphicFrameLocks noChangeAspect="1"/>
             </wp:cNvGraphicFramePr>
@@ -1978,7 +1821,7 @@
         <w:drawing>
           <wp:inline xmlns:a="http://schemas.openxmlformats.org/drawingml/2006/main" xmlns:pic="http://schemas.openxmlformats.org/drawingml/2006/picture">
             <wp:extent cx="6400800" cy="4750594"/>
-            <wp:docPr id="26" name="Picture 26"/>
+            <wp:docPr id="24" name="Picture 24"/>
             <wp:cNvGraphicFramePr>
               <a:graphicFrameLocks noChangeAspect="1"/>
             </wp:cNvGraphicFramePr>
@@ -2049,7 +1892,7 @@
         <w:drawing>
           <wp:inline xmlns:a="http://schemas.openxmlformats.org/drawingml/2006/main" xmlns:pic="http://schemas.openxmlformats.org/drawingml/2006/picture">
             <wp:extent cx="6400800" cy="4750594"/>
-            <wp:docPr id="27" name="Picture 27"/>
+            <wp:docPr id="25" name="Picture 25"/>
             <wp:cNvGraphicFramePr>
               <a:graphicFrameLocks noChangeAspect="1"/>
             </wp:cNvGraphicFramePr>
@@ -2120,7 +1963,7 @@
         <w:drawing>
           <wp:inline xmlns:a="http://schemas.openxmlformats.org/drawingml/2006/main" xmlns:pic="http://schemas.openxmlformats.org/drawingml/2006/picture">
             <wp:extent cx="6400800" cy="4750594"/>
-            <wp:docPr id="28" name="Picture 28"/>
+            <wp:docPr id="26" name="Picture 26"/>
             <wp:cNvGraphicFramePr>
               <a:graphicFrameLocks noChangeAspect="1"/>
             </wp:cNvGraphicFramePr>
@@ -2191,7 +2034,7 @@
         <w:drawing>
           <wp:inline xmlns:a="http://schemas.openxmlformats.org/drawingml/2006/main" xmlns:pic="http://schemas.openxmlformats.org/drawingml/2006/picture">
             <wp:extent cx="6400800" cy="4750594"/>
-            <wp:docPr id="29" name="Picture 29"/>
+            <wp:docPr id="27" name="Picture 27"/>
             <wp:cNvGraphicFramePr>
               <a:graphicFrameLocks noChangeAspect="1"/>
             </wp:cNvGraphicFramePr>
@@ -2262,7 +2105,7 @@
         <w:drawing>
           <wp:inline xmlns:a="http://schemas.openxmlformats.org/drawingml/2006/main" xmlns:pic="http://schemas.openxmlformats.org/drawingml/2006/picture">
             <wp:extent cx="6400800" cy="4750594"/>
-            <wp:docPr id="30" name="Picture 30"/>
+            <wp:docPr id="28" name="Picture 28"/>
             <wp:cNvGraphicFramePr>
               <a:graphicFrameLocks noChangeAspect="1"/>
             </wp:cNvGraphicFramePr>
@@ -2333,7 +2176,7 @@
         <w:drawing>
           <wp:inline xmlns:a="http://schemas.openxmlformats.org/drawingml/2006/main" xmlns:pic="http://schemas.openxmlformats.org/drawingml/2006/picture">
             <wp:extent cx="6400800" cy="4750594"/>
-            <wp:docPr id="31" name="Picture 31"/>
+            <wp:docPr id="29" name="Picture 29"/>
             <wp:cNvGraphicFramePr>
               <a:graphicFrameLocks noChangeAspect="1"/>
             </wp:cNvGraphicFramePr>
@@ -2404,7 +2247,7 @@
         <w:drawing>
           <wp:inline xmlns:a="http://schemas.openxmlformats.org/drawingml/2006/main" xmlns:pic="http://schemas.openxmlformats.org/drawingml/2006/picture">
             <wp:extent cx="6400800" cy="4750594"/>
-            <wp:docPr id="32" name="Picture 32"/>
+            <wp:docPr id="30" name="Picture 30"/>
             <wp:cNvGraphicFramePr>
               <a:graphicFrameLocks noChangeAspect="1"/>
             </wp:cNvGraphicFramePr>
@@ -2475,7 +2318,7 @@
         <w:drawing>
           <wp:inline xmlns:a="http://schemas.openxmlformats.org/drawingml/2006/main" xmlns:pic="http://schemas.openxmlformats.org/drawingml/2006/picture">
             <wp:extent cx="6400800" cy="4750594"/>
-            <wp:docPr id="33" name="Picture 33"/>
+            <wp:docPr id="31" name="Picture 31"/>
             <wp:cNvGraphicFramePr>
               <a:graphicFrameLocks noChangeAspect="1"/>
             </wp:cNvGraphicFramePr>
@@ -2546,7 +2389,7 @@
         <w:drawing>
           <wp:inline xmlns:a="http://schemas.openxmlformats.org/drawingml/2006/main" xmlns:pic="http://schemas.openxmlformats.org/drawingml/2006/picture">
             <wp:extent cx="6400800" cy="4750594"/>
-            <wp:docPr id="34" name="Picture 34"/>
+            <wp:docPr id="32" name="Picture 32"/>
             <wp:cNvGraphicFramePr>
               <a:graphicFrameLocks noChangeAspect="1"/>
             </wp:cNvGraphicFramePr>

</xml_diff>